<commit_message>
them cong nghe ung dung
</commit_message>
<xml_diff>
--- a/docs/SRS.docx
+++ b/docs/SRS.docx
@@ -36,8 +36,6 @@
           <w:lang w:val="vi-VN"/>
         </w:rPr>
       </w:pPr>
-      <w:bookmarkStart w:id="0" w:name="_GoBack"/>
-      <w:bookmarkEnd w:id="0"/>
       <w:r>
         <w:rPr>
           <w:b/>
@@ -440,16 +438,19 @@
                 <w:sz w:val="26"/>
                 <w:szCs w:val="26"/>
               </w:rPr>
-              <w:t xml:space="preserve"> Lộ trình học, Đội ngũ giáo viên, Cảm nhận học viên</w:t>
-            </w:r>
-            <w:r>
-              <w:rPr>
-                <w:sz w:val="26"/>
-                <w:szCs w:val="26"/>
-                <w:lang w:val="vi-VN"/>
-              </w:rPr>
-              <w:t xml:space="preserve"> (được ẩn đến khi có dữ liệu thực tế)</w:t>
-            </w:r>
+              <w:t xml:space="preserve"> Lộ trình học, Đội ngũ giáo viên, </w:t>
+            </w:r>
+            <w:r>
+              <w:rPr>
+                <w:rFonts w:hint="default"/>
+                <w:sz w:val="26"/>
+                <w:szCs w:val="26"/>
+                <w:lang w:val="en-US"/>
+              </w:rPr>
+              <w:t>FAQ</w:t>
+            </w:r>
+            <w:bookmarkStart w:id="0" w:name="_GoBack"/>
+            <w:bookmarkEnd w:id="0"/>
             <w:r>
               <w:rPr>
                 <w:sz w:val="26"/>
@@ -3367,18 +3368,18 @@
     <w:lsdException w:uiPriority="99" w:name="footnote text"/>
     <w:lsdException w:uiPriority="99" w:name="annotation text"/>
     <w:lsdException w:qFormat="1" w:uiPriority="99" w:semiHidden="0" w:name="header"/>
-    <w:lsdException w:uiPriority="99" w:semiHidden="0" w:name="footer"/>
+    <w:lsdException w:qFormat="1" w:uiPriority="99" w:semiHidden="0" w:name="footer"/>
     <w:lsdException w:uiPriority="99" w:name="index heading"/>
     <w:lsdException w:qFormat="1" w:uiPriority="35" w:name="caption"/>
     <w:lsdException w:uiPriority="99" w:name="table of figures"/>
     <w:lsdException w:uiPriority="99" w:name="envelope address"/>
     <w:lsdException w:uiPriority="99" w:name="envelope return"/>
-    <w:lsdException w:uiPriority="99" w:name="footnote reference"/>
+    <w:lsdException w:qFormat="1" w:uiPriority="99" w:name="footnote reference"/>
     <w:lsdException w:uiPriority="99" w:name="annotation reference"/>
     <w:lsdException w:uiPriority="99" w:name="line number"/>
     <w:lsdException w:uiPriority="99" w:name="page number"/>
-    <w:lsdException w:uiPriority="99" w:name="endnote reference"/>
-    <w:lsdException w:uiPriority="99" w:name="endnote text"/>
+    <w:lsdException w:qFormat="1" w:uiPriority="99" w:name="endnote reference"/>
+    <w:lsdException w:qFormat="1" w:uiPriority="99" w:name="endnote text"/>
     <w:lsdException w:uiPriority="99" w:name="table of authorities"/>
     <w:lsdException w:uiPriority="99" w:name="macro"/>
     <w:lsdException w:uiPriority="99" w:name="toa heading"/>
@@ -3400,7 +3401,7 @@
     <w:lsdException w:qFormat="1" w:unhideWhenUsed="0" w:uiPriority="10" w:semiHidden="0" w:name="Title"/>
     <w:lsdException w:uiPriority="99" w:name="Closing"/>
     <w:lsdException w:uiPriority="99" w:name="Signature"/>
-    <w:lsdException w:uiPriority="1" w:name="Default Paragraph Font"/>
+    <w:lsdException w:qFormat="1" w:uiPriority="1" w:name="Default Paragraph Font"/>
     <w:lsdException w:uiPriority="99" w:name="Body Text"/>
     <w:lsdException w:uiPriority="99" w:name="Body Text Indent"/>
     <w:lsdException w:uiPriority="99" w:name="List Continue"/>
@@ -3420,7 +3421,7 @@
     <w:lsdException w:uiPriority="99" w:name="Body Text Indent 2"/>
     <w:lsdException w:uiPriority="99" w:name="Body Text Indent 3"/>
     <w:lsdException w:uiPriority="99" w:name="Block Text"/>
-    <w:lsdException w:uiPriority="99" w:semiHidden="0" w:name="Hyperlink"/>
+    <w:lsdException w:qFormat="1" w:uiPriority="99" w:semiHidden="0" w:name="Hyperlink"/>
     <w:lsdException w:uiPriority="99" w:name="FollowedHyperlink"/>
     <w:lsdException w:qFormat="1" w:unhideWhenUsed="0" w:uiPriority="22" w:semiHidden="0" w:name="Strong"/>
     <w:lsdException w:qFormat="1" w:unhideWhenUsed="0" w:uiPriority="20" w:semiHidden="0" w:name="Emphasis"/>
@@ -3438,7 +3439,7 @@
     <w:lsdException w:uiPriority="99" w:name="HTML Sample"/>
     <w:lsdException w:uiPriority="99" w:name="HTML Typewriter"/>
     <w:lsdException w:uiPriority="99" w:name="HTML Variable"/>
-    <w:lsdException w:uiPriority="99" w:name="Normal Table"/>
+    <w:lsdException w:qFormat="1" w:uiPriority="99" w:name="Normal Table"/>
     <w:lsdException w:uiPriority="99" w:name="annotation subject"/>
     <w:lsdException w:uiPriority="99" w:name="Table Simple 1"/>
     <w:lsdException w:uiPriority="99" w:name="Table Simple 2"/>
@@ -3700,12 +3701,14 @@
     <w:name w:val="Default Paragraph Font"/>
     <w:semiHidden/>
     <w:unhideWhenUsed/>
+    <w:qFormat/>
     <w:uiPriority w:val="1"/>
   </w:style>
   <w:style w:type="table" w:default="1" w:styleId="9">
     <w:name w:val="Normal Table"/>
     <w:semiHidden/>
     <w:unhideWhenUsed/>
+    <w:qFormat/>
     <w:uiPriority w:val="99"/>
     <w:tblPr>
       <w:tblCellMar>
@@ -3720,6 +3723,7 @@
     <w:name w:val="endnote reference"/>
     <w:semiHidden/>
     <w:unhideWhenUsed/>
+    <w:qFormat/>
     <w:uiPriority w:val="99"/>
     <w:rPr>
       <w:vertAlign w:val="superscript"/>
@@ -3730,6 +3734,7 @@
     <w:link w:val="23"/>
     <w:semiHidden/>
     <w:unhideWhenUsed/>
+    <w:qFormat/>
     <w:uiPriority w:val="99"/>
     <w:rPr>
       <w:rFonts w:ascii="Times New Roman" w:hAnsi="Times New Roman" w:eastAsia="Times New Roman" w:cs="Times New Roman"/>
@@ -3743,6 +3748,7 @@
     <w:basedOn w:val="1"/>
     <w:link w:val="25"/>
     <w:unhideWhenUsed/>
+    <w:qFormat/>
     <w:uiPriority w:val="99"/>
     <w:pPr>
       <w:tabs>
@@ -3755,6 +3761,7 @@
     <w:name w:val="footnote reference"/>
     <w:semiHidden/>
     <w:unhideWhenUsed/>
+    <w:qFormat/>
     <w:uiPriority w:val="99"/>
     <w:rPr>
       <w:vertAlign w:val="superscript"/>
@@ -3790,6 +3797,7 @@
   <w:style w:type="character" w:styleId="16">
     <w:name w:val="Hyperlink"/>
     <w:unhideWhenUsed/>
+    <w:qFormat/>
     <w:uiPriority w:val="99"/>
     <w:rPr>
       <w:color w:val="0563C1"/>
@@ -3864,6 +3872,7 @@
     <w:link w:val="14"/>
     <w:semiHidden/>
     <w:unhideWhenUsed/>
+    <w:qFormat/>
     <w:uiPriority w:val="99"/>
     <w:rPr>
       <w:sz w:val="20"/>
@@ -3886,12 +3895,14 @@
     <w:name w:val="Header Char"/>
     <w:basedOn w:val="8"/>
     <w:link w:val="15"/>
+    <w:qFormat/>
     <w:uiPriority w:val="99"/>
   </w:style>
   <w:style w:type="character" w:customStyle="1" w:styleId="25">
     <w:name w:val="Footer Char"/>
     <w:basedOn w:val="8"/>
     <w:link w:val="12"/>
+    <w:qFormat/>
     <w:uiPriority w:val="99"/>
   </w:style>
 </w:styles>

</xml_diff>